<commit_message>
update with valuation models and fixed bug
</commit_message>
<xml_diff>
--- a/ReportsAndDocuments/MenghuaW_Proposal_Final.docx
+++ b/ReportsAndDocuments/MenghuaW_Proposal_Final.docx
@@ -34,13 +34,26 @@
     <w:p>
       <w:pPr>
         <w:jc w:val="center"/>
+        <w:rPr>
+          <w:rFonts w:hint="eastAsia"/>
+          <w:lang w:eastAsia="zh-CN"/>
+        </w:rPr>
       </w:pPr>
       <w:r>
         <w:rPr>
           <w:b/>
           <w:sz w:val="40"/>
         </w:rPr>
-        <w:t>AI-Assisted Personal Investment Research and Decision Support System</w:t>
+        <w:t xml:space="preserve">Personal Investment </w:t>
+      </w:r>
+      <w:r>
+        <w:rPr>
+          <w:rFonts w:hint="eastAsia"/>
+          <w:b/>
+          <w:sz w:val="40"/>
+          <w:lang w:eastAsia="zh-CN"/>
+        </w:rPr>
+        <w:t>Workbench</w:t>
       </w:r>
     </w:p>
     <w:p>

</xml_diff>